<commit_message>
feat: update resume details, tech stack, and portfolio professional summary while migrating to Bun package manager
</commit_message>
<xml_diff>
--- a/public/cv/Phan-Hong-Quan-ATS-Resume.docx
+++ b/public/cv/Phan-Hong-Quan-ATS-Resume.docx
@@ -65,7 +65,29 @@
           <w:sz w:val="24"/>
           <w:sz-cs w:val="24"/>
         </w:rPr>
-        <w:t xml:space="preserve">Portfolio: https://eboost.vn</w:t>
+        <w:t>Portfolio: https://cv-dev-portfolio.vercel.app</w:t>
+      </w:r>
+    </w:p>
+    <w:p>
+      <w:pPr/>
+      <w:r>
+        <w:rPr>
+          <w:rFonts w:ascii="Helvetica Light" w:hAnsi="Helvetica Light" w:cs="Helvetica Light"/>
+          <w:sz w:val="24"/>
+          <w:sz-cs w:val="24"/>
+        </w:rPr>
+        <w:t>Availability: Available to start within 1 week after receiving an offer</w:t>
+      </w:r>
+    </w:p>
+    <w:p>
+      <w:pPr/>
+      <w:r>
+        <w:rPr>
+          <w:rFonts w:ascii="Helvetica Light" w:hAnsi="Helvetica Light" w:cs="Helvetica Light"/>
+          <w:sz w:val="24"/>
+          <w:sz-cs w:val="24"/>
+        </w:rPr>
+        <w:t>English: Reading and writing</w:t>
       </w:r>
     </w:p>
     <w:p>
@@ -153,7 +175,7 @@
           <w:sz w:val="24"/>
           <w:sz-cs w:val="24"/>
         </w:rPr>
-        <w:t xml:space="preserve">Frontend &amp; Mobile: React Native CLI, Next.js (App Router), React, TypeScript, JavaScript, React Navigation.</w:t>
+        <w:t>Frontend &amp; Mobile: React Native CLI, Next.js (App Router), React, Vite, React Router, TypeScript, JavaScript (ES6+), React Navigation.</w:t>
       </w:r>
     </w:p>
     <w:p>
@@ -296,7 +318,7 @@
           <w:sz w:val="24"/>
           <w:sz-cs w:val="24"/>
         </w:rPr>
-        <w:t xml:space="preserve">- Developed CMS modules for operations, marketing, partnerships, and technical monitoring teams.</w:t>
+        <w:t>- Developed the main Ant Design-based CMS dashboard and modules for operations, marketing, partnerships, and technical monitoring teams.</w:t>
       </w:r>
     </w:p>
     <w:p>
@@ -1187,12 +1209,198 @@
           <w:sz w:val="24"/>
           <w:sz-cs w:val="24"/>
         </w:rPr>
-        <w:t xml:space="preserve">React Native, Next.js, React, TypeScript, JavaScript, Frontend Engineer, Mobile App Developer, Redux Toolkit, Redux Saga, React Query, Firebase, REST API, AppCenter CodePush, Ant Design, Chart.js, Mapbox, MQTT, Performance Optimization, Product Delivery.</w:t>
+        <w:t>React Native, Next.js, React, Vite, React Router, TypeScript, JavaScript ES6+, Frontend Engineer, Mobile App Developer, Redux Toolkit, Redux Saga, React Query, Firebase, REST API, AppCenter CodePush, Ant Design, Chart.js, Mapbox, MQTT, Performance Optimization, Product Delivery, English Reading and Writing.</w:t>
       </w:r>
     </w:p>
     <w:sectPr/>
   </w:body>
 </w:document>
+</file>
+
+<file path=word/styles.xml><?xml version="1.0" encoding="utf-8"?>
+<w:styles xmlns:mc="http://schemas.openxmlformats.org/markup-compatibility/2006" xmlns:r="http://schemas.openxmlformats.org/officeDocument/2006/relationships" xmlns:w14="http://schemas.microsoft.com/office/word/2010/wordml" xmlns:w="http://schemas.openxmlformats.org/wordprocessingml/2006/main" mc:Ignorable="w14">
+  <w:docDefaults>
+    <w:rPrDefault>
+      <w:rPr>
+        <w:rFonts w:asciiTheme="minorHAnsi" w:eastAsiaTheme="minorEastAsia" w:hAnsiTheme="minorHAnsi" w:cstheme="minorBidi"/>
+        <w:sz w:val="24"/>
+        <w:szCs w:val="24"/>
+        <w:lang w:val="en-US" w:eastAsia="en-US" w:bidi="ar-SA"/>
+      </w:rPr>
+    </w:rPrDefault>
+    <w:pPrDefault/>
+  </w:docDefaults>
+  <w:latentStyles w:defLockedState="0" w:defUIPriority="99" w:defSemiHidden="1" w:defUnhideWhenUsed="1" w:defQFormat="0" w:count="276">
+    <w:lsdException w:name="Normal" w:semiHidden="0" w:uiPriority="0" w:unhideWhenUsed="0" w:qFormat="1"/>
+    <w:lsdException w:name="heading 1" w:semiHidden="0" w:uiPriority="9" w:unhideWhenUsed="0" w:qFormat="1"/>
+    <w:lsdException w:name="heading 2" w:uiPriority="9" w:qFormat="1"/>
+    <w:lsdException w:name="heading 3" w:uiPriority="9" w:qFormat="1"/>
+    <w:lsdException w:name="heading 4" w:uiPriority="9" w:qFormat="1"/>
+    <w:lsdException w:name="heading 5" w:uiPriority="9" w:qFormat="1"/>
+    <w:lsdException w:name="heading 6" w:uiPriority="9" w:qFormat="1"/>
+    <w:lsdException w:name="heading 7" w:uiPriority="9" w:qFormat="1"/>
+    <w:lsdException w:name="heading 8" w:uiPriority="9" w:qFormat="1"/>
+    <w:lsdException w:name="heading 9" w:uiPriority="9" w:qFormat="1"/>
+    <w:lsdException w:name="toc 1" w:uiPriority="39"/>
+    <w:lsdException w:name="toc 2" w:uiPriority="39"/>
+    <w:lsdException w:name="toc 3" w:uiPriority="39"/>
+    <w:lsdException w:name="toc 4" w:uiPriority="39"/>
+    <w:lsdException w:name="toc 5" w:uiPriority="39"/>
+    <w:lsdException w:name="toc 6" w:uiPriority="39"/>
+    <w:lsdException w:name="toc 7" w:uiPriority="39"/>
+    <w:lsdException w:name="toc 8" w:uiPriority="39"/>
+    <w:lsdException w:name="toc 9" w:uiPriority="39"/>
+    <w:lsdException w:name="caption" w:uiPriority="35" w:qFormat="1"/>
+    <w:lsdException w:name="Title" w:semiHidden="0" w:uiPriority="10" w:unhideWhenUsed="0" w:qFormat="1"/>
+    <w:lsdException w:name="Default Paragraph Font" w:uiPriority="1"/>
+    <w:lsdException w:name="Subtitle" w:semiHidden="0" w:uiPriority="11" w:unhideWhenUsed="0" w:qFormat="1"/>
+    <w:lsdException w:name="Strong" w:semiHidden="0" w:uiPriority="22" w:unhideWhenUsed="0" w:qFormat="1"/>
+    <w:lsdException w:name="Emphasis" w:semiHidden="0" w:uiPriority="20" w:unhideWhenUsed="0" w:qFormat="1"/>
+    <w:lsdException w:name="Table Grid" w:semiHidden="0" w:uiPriority="59" w:unhideWhenUsed="0"/>
+    <w:lsdException w:name="Placeholder Text" w:unhideWhenUsed="0"/>
+    <w:lsdException w:name="No Spacing" w:semiHidden="0" w:uiPriority="1" w:unhideWhenUsed="0" w:qFormat="1"/>
+    <w:lsdException w:name="Light Shading" w:semiHidden="0" w:uiPriority="60" w:unhideWhenUsed="0"/>
+    <w:lsdException w:name="Light List" w:semiHidden="0" w:uiPriority="61" w:unhideWhenUsed="0"/>
+    <w:lsdException w:name="Light Grid" w:semiHidden="0" w:uiPriority="62" w:unhideWhenUsed="0"/>
+    <w:lsdException w:name="Medium Shading 1" w:semiHidden="0" w:uiPriority="63" w:unhideWhenUsed="0"/>
+    <w:lsdException w:name="Medium Shading 2" w:semiHidden="0" w:uiPriority="64" w:unhideWhenUsed="0"/>
+    <w:lsdException w:name="Medium List 1" w:semiHidden="0" w:uiPriority="65" w:unhideWhenUsed="0"/>
+    <w:lsdException w:name="Medium List 2" w:semiHidden="0" w:uiPriority="66" w:unhideWhenUsed="0"/>
+    <w:lsdException w:name="Medium Grid 1" w:semiHidden="0" w:uiPriority="67" w:unhideWhenUsed="0"/>
+    <w:lsdException w:name="Medium Grid 2" w:semiHidden="0" w:uiPriority="68" w:unhideWhenUsed="0"/>
+    <w:lsdException w:name="Medium Grid 3" w:semiHidden="0" w:uiPriority="69" w:unhideWhenUsed="0"/>
+    <w:lsdException w:name="Dark List" w:semiHidden="0" w:uiPriority="70" w:unhideWhenUsed="0"/>
+    <w:lsdException w:name="Colorful Shading" w:semiHidden="0" w:uiPriority="71" w:unhideWhenUsed="0"/>
+    <w:lsdException w:name="Colorful List" w:semiHidden="0" w:uiPriority="72" w:unhideWhenUsed="0"/>
+    <w:lsdException w:name="Colorful Grid" w:semiHidden="0" w:uiPriority="73" w:unhideWhenUsed="0"/>
+    <w:lsdException w:name="Light Shading Accent 1" w:semiHidden="0" w:uiPriority="60" w:unhideWhenUsed="0"/>
+    <w:lsdException w:name="Light List Accent 1" w:semiHidden="0" w:uiPriority="61" w:unhideWhenUsed="0"/>
+    <w:lsdException w:name="Light Grid Accent 1" w:semiHidden="0" w:uiPriority="62" w:unhideWhenUsed="0"/>
+    <w:lsdException w:name="Medium Shading 1 Accent 1" w:semiHidden="0" w:uiPriority="63" w:unhideWhenUsed="0"/>
+    <w:lsdException w:name="Medium Shading 2 Accent 1" w:semiHidden="0" w:uiPriority="64" w:unhideWhenUsed="0"/>
+    <w:lsdException w:name="Medium List 1 Accent 1" w:semiHidden="0" w:uiPriority="65" w:unhideWhenUsed="0"/>
+    <w:lsdException w:name="Revision" w:unhideWhenUsed="0"/>
+    <w:lsdException w:name="List Paragraph" w:semiHidden="0" w:uiPriority="34" w:unhideWhenUsed="0" w:qFormat="1"/>
+    <w:lsdException w:name="Quote" w:semiHidden="0" w:uiPriority="29" w:unhideWhenUsed="0" w:qFormat="1"/>
+    <w:lsdException w:name="Intense Quote" w:semiHidden="0" w:uiPriority="30" w:unhideWhenUsed="0" w:qFormat="1"/>
+    <w:lsdException w:name="Medium List 2 Accent 1" w:semiHidden="0" w:uiPriority="66" w:unhideWhenUsed="0"/>
+    <w:lsdException w:name="Medium Grid 1 Accent 1" w:semiHidden="0" w:uiPriority="67" w:unhideWhenUsed="0"/>
+    <w:lsdException w:name="Medium Grid 2 Accent 1" w:semiHidden="0" w:uiPriority="68" w:unhideWhenUsed="0"/>
+    <w:lsdException w:name="Medium Grid 3 Accent 1" w:semiHidden="0" w:uiPriority="69" w:unhideWhenUsed="0"/>
+    <w:lsdException w:name="Dark List Accent 1" w:semiHidden="0" w:uiPriority="70" w:unhideWhenUsed="0"/>
+    <w:lsdException w:name="Colorful Shading Accent 1" w:semiHidden="0" w:uiPriority="71" w:unhideWhenUsed="0"/>
+    <w:lsdException w:name="Colorful List Accent 1" w:semiHidden="0" w:uiPriority="72" w:unhideWhenUsed="0"/>
+    <w:lsdException w:name="Colorful Grid Accent 1" w:semiHidden="0" w:uiPriority="73" w:unhideWhenUsed="0"/>
+    <w:lsdException w:name="Light Shading Accent 2" w:semiHidden="0" w:uiPriority="60" w:unhideWhenUsed="0"/>
+    <w:lsdException w:name="Light List Accent 2" w:semiHidden="0" w:uiPriority="61" w:unhideWhenUsed="0"/>
+    <w:lsdException w:name="Light Grid Accent 2" w:semiHidden="0" w:uiPriority="62" w:unhideWhenUsed="0"/>
+    <w:lsdException w:name="Medium Shading 1 Accent 2" w:semiHidden="0" w:uiPriority="63" w:unhideWhenUsed="0"/>
+    <w:lsdException w:name="Medium Shading 2 Accent 2" w:semiHidden="0" w:uiPriority="64" w:unhideWhenUsed="0"/>
+    <w:lsdException w:name="Medium List 1 Accent 2" w:semiHidden="0" w:uiPriority="65" w:unhideWhenUsed="0"/>
+    <w:lsdException w:name="Medium List 2 Accent 2" w:semiHidden="0" w:uiPriority="66" w:unhideWhenUsed="0"/>
+    <w:lsdException w:name="Medium Grid 1 Accent 2" w:semiHidden="0" w:uiPriority="67" w:unhideWhenUsed="0"/>
+    <w:lsdException w:name="Medium Grid 2 Accent 2" w:semiHidden="0" w:uiPriority="68" w:unhideWhenUsed="0"/>
+    <w:lsdException w:name="Medium Grid 3 Accent 2" w:semiHidden="0" w:uiPriority="69" w:unhideWhenUsed="0"/>
+    <w:lsdException w:name="Dark List Accent 2" w:semiHidden="0" w:uiPriority="70" w:unhideWhenUsed="0"/>
+    <w:lsdException w:name="Colorful Shading Accent 2" w:semiHidden="0" w:uiPriority="71" w:unhideWhenUsed="0"/>
+    <w:lsdException w:name="Colorful List Accent 2" w:semiHidden="0" w:uiPriority="72" w:unhideWhenUsed="0"/>
+    <w:lsdException w:name="Colorful Grid Accent 2" w:semiHidden="0" w:uiPriority="73" w:unhideWhenUsed="0"/>
+    <w:lsdException w:name="Light Shading Accent 3" w:semiHidden="0" w:uiPriority="60" w:unhideWhenUsed="0"/>
+    <w:lsdException w:name="Light List Accent 3" w:semiHidden="0" w:uiPriority="61" w:unhideWhenUsed="0"/>
+    <w:lsdException w:name="Light Grid Accent 3" w:semiHidden="0" w:uiPriority="62" w:unhideWhenUsed="0"/>
+    <w:lsdException w:name="Medium Shading 1 Accent 3" w:semiHidden="0" w:uiPriority="63" w:unhideWhenUsed="0"/>
+    <w:lsdException w:name="Medium Shading 2 Accent 3" w:semiHidden="0" w:uiPriority="64" w:unhideWhenUsed="0"/>
+    <w:lsdException w:name="Medium List 1 Accent 3" w:semiHidden="0" w:uiPriority="65" w:unhideWhenUsed="0"/>
+    <w:lsdException w:name="Medium List 2 Accent 3" w:semiHidden="0" w:uiPriority="66" w:unhideWhenUsed="0"/>
+    <w:lsdException w:name="Medium Grid 1 Accent 3" w:semiHidden="0" w:uiPriority="67" w:unhideWhenUsed="0"/>
+    <w:lsdException w:name="Medium Grid 2 Accent 3" w:semiHidden="0" w:uiPriority="68" w:unhideWhenUsed="0"/>
+    <w:lsdException w:name="Medium Grid 3 Accent 3" w:semiHidden="0" w:uiPriority="69" w:unhideWhenUsed="0"/>
+    <w:lsdException w:name="Dark List Accent 3" w:semiHidden="0" w:uiPriority="70" w:unhideWhenUsed="0"/>
+    <w:lsdException w:name="Colorful Shading Accent 3" w:semiHidden="0" w:uiPriority="71" w:unhideWhenUsed="0"/>
+    <w:lsdException w:name="Colorful List Accent 3" w:semiHidden="0" w:uiPriority="72" w:unhideWhenUsed="0"/>
+    <w:lsdException w:name="Colorful Grid Accent 3" w:semiHidden="0" w:uiPriority="73" w:unhideWhenUsed="0"/>
+    <w:lsdException w:name="Light Shading Accent 4" w:semiHidden="0" w:uiPriority="60" w:unhideWhenUsed="0"/>
+    <w:lsdException w:name="Light List Accent 4" w:semiHidden="0" w:uiPriority="61" w:unhideWhenUsed="0"/>
+    <w:lsdException w:name="Light Grid Accent 4" w:semiHidden="0" w:uiPriority="62" w:unhideWhenUsed="0"/>
+    <w:lsdException w:name="Medium Shading 1 Accent 4" w:semiHidden="0" w:uiPriority="63" w:unhideWhenUsed="0"/>
+    <w:lsdException w:name="Medium Shading 2 Accent 4" w:semiHidden="0" w:uiPriority="64" w:unhideWhenUsed="0"/>
+    <w:lsdException w:name="Medium List 1 Accent 4" w:semiHidden="0" w:uiPriority="65" w:unhideWhenUsed="0"/>
+    <w:lsdException w:name="Medium List 2 Accent 4" w:semiHidden="0" w:uiPriority="66" w:unhideWhenUsed="0"/>
+    <w:lsdException w:name="Medium Grid 1 Accent 4" w:semiHidden="0" w:uiPriority="67" w:unhideWhenUsed="0"/>
+    <w:lsdException w:name="Medium Grid 2 Accent 4" w:semiHidden="0" w:uiPriority="68" w:unhideWhenUsed="0"/>
+    <w:lsdException w:name="Medium Grid 3 Accent 4" w:semiHidden="0" w:uiPriority="69" w:unhideWhenUsed="0"/>
+    <w:lsdException w:name="Dark List Accent 4" w:semiHidden="0" w:uiPriority="70" w:unhideWhenUsed="0"/>
+    <w:lsdException w:name="Colorful Shading Accent 4" w:semiHidden="0" w:uiPriority="71" w:unhideWhenUsed="0"/>
+    <w:lsdException w:name="Colorful List Accent 4" w:semiHidden="0" w:uiPriority="72" w:unhideWhenUsed="0"/>
+    <w:lsdException w:name="Colorful Grid Accent 4" w:semiHidden="0" w:uiPriority="73" w:unhideWhenUsed="0"/>
+    <w:lsdException w:name="Light Shading Accent 5" w:semiHidden="0" w:uiPriority="60" w:unhideWhenUsed="0"/>
+    <w:lsdException w:name="Light List Accent 5" w:semiHidden="0" w:uiPriority="61" w:unhideWhenUsed="0"/>
+    <w:lsdException w:name="Light Grid Accent 5" w:semiHidden="0" w:uiPriority="62" w:unhideWhenUsed="0"/>
+    <w:lsdException w:name="Medium Shading 1 Accent 5" w:semiHidden="0" w:uiPriority="63" w:unhideWhenUsed="0"/>
+    <w:lsdException w:name="Medium Shading 2 Accent 5" w:semiHidden="0" w:uiPriority="64" w:unhideWhenUsed="0"/>
+    <w:lsdException w:name="Medium List 1 Accent 5" w:semiHidden="0" w:uiPriority="65" w:unhideWhenUsed="0"/>
+    <w:lsdException w:name="Medium List 2 Accent 5" w:semiHidden="0" w:uiPriority="66" w:unhideWhenUsed="0"/>
+    <w:lsdException w:name="Medium Grid 1 Accent 5" w:semiHidden="0" w:uiPriority="67" w:unhideWhenUsed="0"/>
+    <w:lsdException w:name="Medium Grid 2 Accent 5" w:semiHidden="0" w:uiPriority="68" w:unhideWhenUsed="0"/>
+    <w:lsdException w:name="Medium Grid 3 Accent 5" w:semiHidden="0" w:uiPriority="69" w:unhideWhenUsed="0"/>
+    <w:lsdException w:name="Dark List Accent 5" w:semiHidden="0" w:uiPriority="70" w:unhideWhenUsed="0"/>
+    <w:lsdException w:name="Colorful Shading Accent 5" w:semiHidden="0" w:uiPriority="71" w:unhideWhenUsed="0"/>
+    <w:lsdException w:name="Colorful List Accent 5" w:semiHidden="0" w:uiPriority="72" w:unhideWhenUsed="0"/>
+    <w:lsdException w:name="Colorful Grid Accent 5" w:semiHidden="0" w:uiPriority="73" w:unhideWhenUsed="0"/>
+    <w:lsdException w:name="Light Shading Accent 6" w:semiHidden="0" w:uiPriority="60" w:unhideWhenUsed="0"/>
+    <w:lsdException w:name="Light List Accent 6" w:semiHidden="0" w:uiPriority="61" w:unhideWhenUsed="0"/>
+    <w:lsdException w:name="Light Grid Accent 6" w:semiHidden="0" w:uiPriority="62" w:unhideWhenUsed="0"/>
+    <w:lsdException w:name="Medium Shading 1 Accent 6" w:semiHidden="0" w:uiPriority="63" w:unhideWhenUsed="0"/>
+    <w:lsdException w:name="Medium Shading 2 Accent 6" w:semiHidden="0" w:uiPriority="64" w:unhideWhenUsed="0"/>
+    <w:lsdException w:name="Medium List 1 Accent 6" w:semiHidden="0" w:uiPriority="65" w:unhideWhenUsed="0"/>
+    <w:lsdException w:name="Medium List 2 Accent 6" w:semiHidden="0" w:uiPriority="66" w:unhideWhenUsed="0"/>
+    <w:lsdException w:name="Medium Grid 1 Accent 6" w:semiHidden="0" w:uiPriority="67" w:unhideWhenUsed="0"/>
+    <w:lsdException w:name="Medium Grid 2 Accent 6" w:semiHidden="0" w:uiPriority="68" w:unhideWhenUsed="0"/>
+    <w:lsdException w:name="Medium Grid 3 Accent 6" w:semiHidden="0" w:uiPriority="69" w:unhideWhenUsed="0"/>
+    <w:lsdException w:name="Dark List Accent 6" w:semiHidden="0" w:uiPriority="70" w:unhideWhenUsed="0"/>
+    <w:lsdException w:name="Colorful Shading Accent 6" w:semiHidden="0" w:uiPriority="71" w:unhideWhenUsed="0"/>
+    <w:lsdException w:name="Colorful List Accent 6" w:semiHidden="0" w:uiPriority="72" w:unhideWhenUsed="0"/>
+    <w:lsdException w:name="Colorful Grid Accent 6" w:semiHidden="0" w:uiPriority="73" w:unhideWhenUsed="0"/>
+    <w:lsdException w:name="Subtle Emphasis" w:semiHidden="0" w:uiPriority="19" w:unhideWhenUsed="0" w:qFormat="1"/>
+    <w:lsdException w:name="Intense Emphasis" w:semiHidden="0" w:uiPriority="21" w:unhideWhenUsed="0" w:qFormat="1"/>
+    <w:lsdException w:name="Subtle Reference" w:semiHidden="0" w:uiPriority="31" w:unhideWhenUsed="0" w:qFormat="1"/>
+    <w:lsdException w:name="Intense Reference" w:semiHidden="0" w:uiPriority="32" w:unhideWhenUsed="0" w:qFormat="1"/>
+    <w:lsdException w:name="Book Title" w:semiHidden="0" w:uiPriority="33" w:unhideWhenUsed="0" w:qFormat="1"/>
+    <w:lsdException w:name="Bibliography" w:uiPriority="37"/>
+    <w:lsdException w:name="TOC Heading" w:uiPriority="39" w:qFormat="1"/>
+  </w:latentStyles>
+  <w:style w:type="paragraph" w:default="1" w:styleId="Normal">
+    <w:name w:val="Normal"/>
+    <w:qFormat/>
+  </w:style>
+  <w:style w:type="character" w:default="1" w:styleId="DefaultParagraphFont">
+    <w:name w:val="Default Paragraph Font"/>
+    <w:uiPriority w:val="1"/>
+    <w:semiHidden/>
+    <w:unhideWhenUsed/>
+  </w:style>
+  <w:style w:type="table" w:default="1" w:styleId="TableNormal">
+    <w:name w:val="Normal Table"/>
+    <w:uiPriority w:val="99"/>
+    <w:semiHidden/>
+    <w:unhideWhenUsed/>
+    <w:tblPr>
+      <w:tblInd w:w="0" w:type="dxa"/>
+      <w:tblCellMar>
+        <w:top w:w="0" w:type="dxa"/>
+        <w:left w:w="108" w:type="dxa"/>
+        <w:bottom w:w="0" w:type="dxa"/>
+        <w:right w:w="108" w:type="dxa"/>
+      </w:tblCellMar>
+    </w:tblPr>
+  </w:style>
+  <w:style w:type="numbering" w:default="1" w:styleId="NoList">
+    <w:name w:val="No List"/>
+    <w:uiPriority w:val="99"/>
+    <w:semiHidden/>
+    <w:unhideWhenUsed/>
+  </w:style>
+</w:styles>
 </file>
 
 <file path=word/theme/theme1.xml><?xml version="1.0" encoding="utf-8"?>

</xml_diff>